<commit_message>
ansible - templates updated
</commit_message>
<xml_diff>
--- a/Ansible/12-templates.docx
+++ b/Ansible/12-templates.docx
@@ -979,16 +979,40 @@
           <w:sz w:val="28"/>
           <w:szCs w:val="28"/>
         </w:rPr>
-        <w:t>in .j</w:t>
+        <w:t xml:space="preserve">in </w:t>
+      </w:r>
+      <w:r>
+        <w:rPr>
+          <w:rFonts w:asciiTheme="majorBidi" w:hAnsiTheme="majorBidi" w:cstheme="majorBidi"/>
+          <w:b/>
+          <w:bCs/>
+          <w:i/>
+          <w:iCs/>
+          <w:sz w:val="28"/>
+          <w:szCs w:val="28"/>
+        </w:rPr>
+        <w:t>.j</w:t>
       </w:r>
       <w:proofErr w:type="gramEnd"/>
       <w:r>
         <w:rPr>
           <w:rFonts w:asciiTheme="majorBidi" w:hAnsiTheme="majorBidi" w:cstheme="majorBidi"/>
-          <w:sz w:val="28"/>
-          <w:szCs w:val="28"/>
-        </w:rPr>
-        <w:t>2 to indicate they are Jinja2 templates.</w:t>
+          <w:b/>
+          <w:bCs/>
+          <w:i/>
+          <w:iCs/>
+          <w:sz w:val="28"/>
+          <w:szCs w:val="28"/>
+        </w:rPr>
+        <w:t>2</w:t>
+      </w:r>
+      <w:r>
+        <w:rPr>
+          <w:rFonts w:asciiTheme="majorBidi" w:hAnsiTheme="majorBidi" w:cstheme="majorBidi"/>
+          <w:sz w:val="28"/>
+          <w:szCs w:val="28"/>
+        </w:rPr>
+        <w:t xml:space="preserve"> to indicate they are Jinja2 templates.</w:t>
       </w:r>
     </w:p>
     <w:p>
@@ -5963,17 +5987,7 @@
           <w:sz w:val="36"/>
           <w:szCs w:val="36"/>
         </w:rPr>
-        <w:t>Complex Data Filtering inside Templates</w:t>
-      </w:r>
-      <w:r>
-        <w:rPr>
-          <w:rFonts w:asciiTheme="majorBidi" w:hAnsiTheme="majorBidi" w:cstheme="majorBidi"/>
-          <w:b/>
-          <w:bCs/>
-          <w:sz w:val="36"/>
-          <w:szCs w:val="36"/>
-        </w:rPr>
-        <w:t>:</w:t>
+        <w:t>Complex Data Filtering inside Templates:</w:t>
       </w:r>
     </w:p>
     <w:p>
@@ -12562,6 +12576,7 @@
     </w:p>
     <w:p>
       <w:pPr>
+        <w:spacing w:after="80"/>
         <w:rPr>
           <w:rFonts w:asciiTheme="majorBidi" w:hAnsiTheme="majorBidi" w:cstheme="majorBidi"/>
           <w:sz w:val="28"/>

</xml_diff>